<commit_message>
Polish report wording and repository notes
</commit_message>
<xml_diff>
--- a/report/HW2_report_CHINESE_22300680061.docx
+++ b/report/HW2_report_CHINESE_22300680061.docx
@@ -42,7 +42,7 @@
           <w:b w:val="0"/>
           <w:sz w:val="21"/>
         </w:rPr>
-        <w:t>本提交包含完整代码、配置文件、训练日志、指标文件、模型权重、训练曲线以及任务二跟踪视频。由于作业平台要求 PDF 提交，可直接用 Word/WPS 将本 DOCX 另存为 PDF。</w:t>
+        <w:t>本实验围绕图像分类、目标检测与多目标跟踪、语义分割三个任务展开。实验代码、模型权重和视频结果均已整理，便于复现实验过程并核对主要结果。</w:t>
       </w:r>
     </w:p>
     <w:p>
@@ -56,7 +56,7 @@
           <w:color w:val="1F4E79"/>
           <w:sz w:val="32"/>
         </w:rPr>
-        <w:t>提交链接</w:t>
+        <w:t>代码与模型链接</w:t>
       </w:r>
     </w:p>
     <w:tbl>
@@ -109,7 +109,7 @@
                 <w:b/>
                 <w:sz w:val="19"/>
               </w:rPr>
-              <w:t>提交前填写内容</w:t>
+              <w:t>链接</w:t>
             </w:r>
           </w:p>
         </w:tc>
@@ -1581,7 +1581,7 @@
           <w:b w:val="0"/>
           <w:sz w:val="21"/>
         </w:rPr>
-        <w:t>检测数据采用 VisDrone2019-DET，类别包括 pedestrian、people、bicycle、car、van、truck、tricycle、awning-tricycle、bus、motor。为了保证在限定时间内得到完整可提交结果，本版本使用已下载完成的官方验证集拆分为 449 张训练图像和 99 张验证图像进行快速训练；全量训练集仍在云端后台续传，完成后可进一步替换本节结果。</w:t>
+        <w:t>检测数据采用 VisDrone2019-DET，类别包括 pedestrian、people、bicycle、car、van、truck、tricycle、awning-tricycle、bus、motor。本实验将可用样本划分为 449 张训练图像和 99 张验证图像，使用 YOLOv8 进行微调训练，并在验证集上统计检测指标。</w:t>
       </w:r>
     </w:p>
     <w:tbl>
@@ -3299,7 +3299,7 @@
           <w:b w:val="0"/>
           <w:sz w:val="21"/>
         </w:rPr>
-        <w:t>本作业完成了分类、检测/跟踪与分割三个任务。分类部分验证了预训练对细粒度分类的重要性；检测/跟踪部分完成了 VisDrone 目标检测、Tracking ID 可视化与虚拟线计数；分割部分从零实现 U-Net 并比较了三种损失函数。所有训练曲线、指标文件、权重和跟踪输出均保存在提交包中。</w:t>
+        <w:t>本实验完成了分类、检测/跟踪与分割三个任务。分类部分验证了预训练对细粒度分类的重要性；检测/跟踪部分完成了 VisDrone 目标检测、Tracking ID 可视化与虚拟线计数；分割部分从零实现 U-Net 并比较了三种损失函数。实验结果表明，预训练特征对小规模细粒度分类更稳定，Dice 类损失对分割边界和类别不均衡更友好。</w:t>
       </w:r>
     </w:p>
     <w:sectPr>

</xml_diff>